<commit_message>
Mise a jour des rapports de coherence - 16/02/2026
- 203 rapports de coherence
- 2194 questionnaires a rejeter

Co-Authored-By: Claude Opus 4.6 <noreply@anthropic.com>
</commit_message>
<xml_diff>
--- a/rapports/16_02_2026/ABD/coh_EQ13_sup_081101000028.docx
+++ b/rapports/16_02_2026/ABD/coh_EQ13_sup_081101000028.docx
@@ -25,7 +25,7 @@
         <w:br/>
         <w:t>Grappe: 081101000028</w:t>
         <w:br/>
-        <w:t>Date: 16/02/2026 a 12:40</w:t>
+        <w:t>Date: 16/02/2026 a 12:58</w:t>
       </w:r>
     </w:p>
     <w:p/>
@@ -1608,7 +1608,7 @@
         <w:rPr>
           <w:sz w:val="20"/>
         </w:rPr>
-        <w:t>- L'entreprise enseigner le coran existe dit n'avoir pas fait la revente de marchandises achetées et revendues en état, aussi le montant obtenus sur la vente de produits transformés par l'entreprise  n'a reçu aucune somme sur les reventes (s10q46=0 &amp; s10q48=0 &amp; s10q50=0); alors s'agit-il de quelle entreprise ?</w:t>
+        <w:t>- L'entreprise enseigner le coran existe dit n'avoir pas fait la revente de marchandises achetées et revendues en état, aussi le montant obtenus sur la vente de produits transformés par l'entreprise  n'a reçu aucune somme sur les reventes (s10q46=0 &amp; s10q48=0 &amp; s10q50=0); alors s'agit-il de quelle entreprise ? Le salaire qu'une personne de cette catégorie (10.62) a travaillé(e) dans cette entreprise enseigner le coran est élevé ou faible. Prière de confirmer cette information avec le QG ou de corriger.</w:t>
       </w:r>
     </w:p>
     <w:p>

</xml_diff>